<commit_message>
Card NC.3c run: TTC beats looming on real highD cut-ins at every gap range; handover banner for the naturalistic results; the note for JJ marked not to send as it stands
Co-Authored-By: Claude Opus 5.5 <noreply@anthropic.com>
</commit_message>
<xml_diff>
--- a/docs/note_for_jj_horizon_sum.docx
+++ b/docs/note_for_jj_horizon_sum.docx
@@ -9,6 +9,66 @@
       </w:pPr>
       <w:r>
         <w:t xml:space="preserve">A note for JJ: what we found when we put the full active-inference stack on the cut-in data</w:t>
+      </w:r>
+    </w:p>
+    <w:p>
+      <w:pPr>
+        <w:pStyle w:val="BlockText"/>
+      </w:pPr>
+      <w:r>
+        <w:rPr>
+          <w:b/>
+          <w:bCs/>
+        </w:rPr>
+        <w:t xml:space="preserve">[2026-09-24, do not send as it stands.]</w:t>
+      </w:r>
+      <w:r>
+        <w:t xml:space="preserve"> </w:t>
+      </w:r>
+      <w:r>
+        <w:t xml:space="preserve">The naturalistic data arrived after this note was</w:t>
+      </w:r>
+      <w:r>
+        <w:t xml:space="preserve"> </w:t>
+      </w:r>
+      <w:r>
+        <w:t xml:space="preserve">drafted. On 2,208 real highD cut-ins the followers’ braking responses are ordered by inverse TTC</w:t>
+      </w:r>
+      <w:r>
+        <w:t xml:space="preserve"> </w:t>
+      </w:r>
+      <w:r>
+        <w:t xml:space="preserve">better than by looming (cards NC.3, NC.3c), so this note’s statement that</w:t>
+      </w:r>
+      <w:r>
+        <w:t xml:space="preserve"> </w:t>
+      </w:r>
+      <w:r>
+        <w:t xml:space="preserve">“these participants</w:t>
+      </w:r>
+      <w:r>
+        <w:t xml:space="preserve"> </w:t>
+      </w:r>
+      <w:r>
+        <w:t xml:space="preserve">respond to optical expansion (Δv/gap²)”</w:t>
+      </w:r>
+      <w:r>
+        <w:t xml:space="preserve"> </w:t>
+      </w:r>
+      <w:r>
+        <w:t xml:space="preserve">holds for the video study only. The horizon-sum argument</w:t>
+      </w:r>
+      <w:r>
+        <w:t xml:space="preserve"> </w:t>
+      </w:r>
+      <w:r>
+        <w:t xml:space="preserve">is unaffected; the gate is now measured on highD (card JJ.9). Revise with Jonas’s answer to</w:t>
+      </w:r>
+      <w:r>
+        <w:t xml:space="preserve"> </w:t>
+      </w:r>
+      <w:r>
+        <w:t xml:space="preserve">query NC3C.Q1 before sending.</w:t>
       </w:r>
     </w:p>
     <w:p>

</xml_diff>